<commit_message>
add my first report
</commit_message>
<xml_diff>
--- a/FinalReport_revised.docx
+++ b/FinalReport_revised.docx
@@ -3108,7 +3108,7 @@
           <w:color w:val="1a1a1a"/>
           <w:rtl w:val="0"/>
         </w:rPr>
-        <w:t xml:space="preserve">The parametric model is a logistic regression estimated by maximum likelihood (MLE). I added predictors in four blocks of related variables: customer profile, contact history, economy and timing (variables listed in Table 3). M1 holds the first block and M4 all four; I compared these nested models with LRTs, AIC and BIC (Appendix B). Age enters as six groups (17-24, 25-34, 35-44, 45-54, 55-64 and 65+) because a quadratic term showed a U-shape: young and old customers subscribe more (LRT p &lt; 0.001). The largest VIF in M4 is 3.3.</w:t>
+        <w:t xml:space="preserve">The parametric model is a logistic regression estimated by maximum likelihood (MLE). I built six candidate models (Table 4): M1 to M4 add one block of predictors at a time, and M5 and M6 add an interaction to M4. LRTs, AIC and BIC (Appendix B) selected M4 as the final model. Age enters as six groups (17-24, 25-34, 35-44, 45-54, 55-64 and 65+) because a quadratic term showed a U-shape: young and old customers subscribe more (LRT p &lt; 0.001). The largest VIF in M4 is 3.3.</w:t>
       </w:r>
     </w:p>
     <w:p>
@@ -3139,7 +3139,7 @@
           <w:color w:val="1a1a1a"/>
           <w:rtl w:val="0"/>
         </w:rPr>
-        <w:t xml:space="preserve">Besides MLE, I use Bayesian estimation: the posterior is proportional to the likelihood times the prior. Segment subscription rates (for example, by age group) use a Beta prior and Binomial likelihood. I also refitted M4 with Normal(0, 2.5²) priors and sampled its posterior with Metropolis-Hastings MCMC, checking trace plots, autocorrelation, R-hat and effective sample size (ESS; Gelman et al., 2013). Table 3 gives each model’s settings. A 1,000-resample bootstrap tests the test-set AUC difference between gradient boosting and logistic regression, and a time-based test trains on phases 1 and 2 and predicts phase 3.</w:t>
+        <w:t xml:space="preserve">Besides MLE, I use Bayesian estimation: the posterior is proportional to the likelihood times the prior. Segment subscription rates (for example, by age group) use a Beta prior and Binomial likelihood. I also refitted M4 with Normal(0, 2.5²) priors and sampled its posterior with Metropolis-Hastings MCMC, checking trace plots, autocorrelation, R-hat and effective sample size (ESS; Gelman et al., 2013). A 1,000-resample bootstrap tests the test-set AUC difference between gradient boosting and logistic regression, and a time-based test trains on phases 1 and 2 and predicts phase 3.</w:t>
       </w:r>
     </w:p>
     <w:tbl>
@@ -3473,48 +3473,43 @@
                 <w:szCs w:val="17"/>
                 <w:rtl w:val="0"/>
               </w:rPr>
-              <w:t xml:space="preserve">MLE (statsmodels). Blocks: customer profile (age group, job, marital, education, default_unk); contact history (contact, poutcome, log2(campaign)); economy (nr.employed, cons.price.idx, cons.conf.idx); timing (month, day_of_week). M1 = profile only; M4 = all four blocks. log2(campaign) gives the OR per doubling of calls. nr.employed chosen over euribor3m (AIC 18,484 vs 18,504)</w:t>
-            </w:r>
-          </w:p>
-        </w:tc>
-        <w:tc>
-          <w:tcPr>
-            <w:tcBorders>
-              <w:top w:color="bfbfbf" w:space="0" w:sz="4" w:val="single"/>
-              <w:left w:color="bfbfbf" w:space="0" w:sz="4" w:val="single"/>
-              <w:bottom w:color="bfbfbf" w:space="0" w:sz="4" w:val="single"/>
-              <w:right w:color="bfbfbf" w:space="0" w:sz="4" w:val="single"/>
-            </w:tcBorders>
-            <w:tcMar>
-              <w:top w:w="50.0" w:type="dxa"/>
-              <w:left w:w="80.0" w:type="dxa"/>
-              <w:bottom w:w="50.0" w:type="dxa"/>
-              <w:right w:w="80.0" w:type="dxa"/>
-            </w:tcMar>
-            <w:vAlign w:val="top"/>
-          </w:tcPr>
-          <w:p>
-            <w:pPr>
-              <w:spacing w:line="240" w:lineRule="auto"/>
-              <w:rPr>
-                <w:rFonts w:ascii="Calibri" w:cs="Calibri" w:eastAsia="Calibri" w:hAnsi="Calibri"/>
-                <w:color w:val="1a1a1a"/>
-              </w:rPr>
-            </w:pPr>
-            <w:r>
-              <w:rPr>
-                <w:rFonts w:ascii="Calibri" w:cs="Calibri" w:eastAsia="Calibri" w:hAnsi="Calibri"/>
-                <w:color w:val="1a1a1a"/>
-                <w:sz w:val="17"/>
-                <w:szCs w:val="17"/>
-                <w:rtl w:val="0"/>
-              </w:rPr>
-              <w:t xml:space="preserve">Model M4, 47 parameters</w:t>
-            </w:r>
-            <w:r>
-              <w:rPr>
-                <w:rtl w:val="0"/>
-              </w:rPr>
+              <w:t xml:space="preserve">MLE (statsmodels). Six nested candidate models (Table 4). nr.employed chosen over euribor3m (AIC 18,484 vs 18,504). log2(campaign) gives the OR per doubling of calls.</w:t>
+            </w:r>
+          </w:p>
+        </w:tc>
+        <w:tc>
+          <w:tcPr>
+            <w:tcBorders>
+              <w:top w:color="bfbfbf" w:space="0" w:sz="4" w:val="single"/>
+              <w:left w:color="bfbfbf" w:space="0" w:sz="4" w:val="single"/>
+              <w:bottom w:color="bfbfbf" w:space="0" w:sz="4" w:val="single"/>
+              <w:right w:color="bfbfbf" w:space="0" w:sz="4" w:val="single"/>
+            </w:tcBorders>
+            <w:tcMar>
+              <w:top w:w="50.0" w:type="dxa"/>
+              <w:left w:w="80.0" w:type="dxa"/>
+              <w:bottom w:w="50.0" w:type="dxa"/>
+              <w:right w:w="80.0" w:type="dxa"/>
+            </w:tcMar>
+            <w:vAlign w:val="top"/>
+          </w:tcPr>
+          <w:p>
+            <w:pPr>
+              <w:spacing w:line="240" w:lineRule="auto"/>
+              <w:rPr>
+                <w:rFonts w:ascii="Calibri" w:cs="Calibri" w:eastAsia="Calibri" w:hAnsi="Calibri"/>
+                <w:color w:val="1a1a1a"/>
+              </w:rPr>
+            </w:pPr>
+            <w:r>
+              <w:rPr>
+                <w:rFonts w:ascii="Calibri" w:cs="Calibri" w:eastAsia="Calibri" w:hAnsi="Calibri"/>
+                <w:color w:val="1a1a1a"/>
+                <w:sz w:val="17"/>
+                <w:szCs w:val="17"/>
+                <w:rtl w:val="0"/>
+              </w:rPr>
+              <w:t xml:space="preserve">Model M4 (all four blocks), 47 parameters: intercept + 46 coefficients</w:t>
             </w:r>
           </w:p>
         </w:tc>
@@ -4413,6 +4408,1374 @@
         <w:rPr>
           <w:rtl w:val="0"/>
         </w:rPr>
+      </w:r>
+    </w:p>
+    <w:tbl>
+      <w:tblPr>
+        <w:tblStyle w:val="Table3"/>
+        <w:tblW w:w="9015.0" w:type="dxa"/>
+        <w:jc w:val="left"/>
+        <w:tblBorders>
+          <w:top w:color="000000" w:space="0" w:sz="4" w:val="single"/>
+          <w:left w:color="000000" w:space="0" w:sz="4" w:val="single"/>
+          <w:bottom w:color="000000" w:space="0" w:sz="4" w:val="single"/>
+          <w:right w:color="000000" w:space="0" w:sz="4" w:val="single"/>
+          <w:insideH w:color="000000" w:space="0" w:sz="4" w:val="single"/>
+          <w:insideV w:color="000000" w:space="0" w:sz="4" w:val="single"/>
+        </w:tblBorders>
+        <w:tblLayout w:type="fixed"/>
+        <w:tblLook w:val="0000"/>
+      </w:tblPr>
+      <w:tblGrid>
+        <w:gridCol w:w="800"/>
+        <w:gridCol w:w="4115"/>
+        <w:gridCol w:w="1100"/>
+        <w:gridCol w:w="1100"/>
+        <w:gridCol w:w="1900"/>
+      </w:tblGrid>
+      <w:tr>
+        <w:trPr>
+          <w:cantSplit w:val="1"/>
+          <w:tblHeader w:val="1"/>
+        </w:trPr>
+        <w:tc>
+          <w:tcPr>
+            <w:tcBorders>
+              <w:top w:color="bfbfbf" w:space="0" w:sz="4" w:val="single"/>
+              <w:left w:color="bfbfbf" w:space="0" w:sz="4" w:val="single"/>
+              <w:bottom w:color="bfbfbf" w:space="0" w:sz="4" w:val="single"/>
+              <w:right w:color="bfbfbf" w:space="0" w:sz="4" w:val="single"/>
+            </w:tcBorders>
+            <w:shd w:fill="e7edf5" w:val="clear"/>
+            <w:tcMar>
+              <w:top w:w="50.0" w:type="dxa"/>
+              <w:left w:w="80.0" w:type="dxa"/>
+              <w:bottom w:w="50.0" w:type="dxa"/>
+              <w:right w:w="80.0" w:type="dxa"/>
+            </w:tcMar>
+            <w:vAlign w:val="top"/>
+          </w:tcPr>
+          <w:p>
+            <w:pPr>
+              <w:spacing w:line="240" w:lineRule="auto"/>
+              <w:rPr>
+                <w:rFonts w:ascii="Calibri" w:cs="Calibri" w:eastAsia="Calibri" w:hAnsi="Calibri"/>
+                <w:color w:val="1a1a1a"/>
+              </w:rPr>
+            </w:pPr>
+            <w:r>
+              <w:rPr>
+                <w:rFonts w:ascii="Calibri" w:cs="Calibri" w:eastAsia="Calibri" w:hAnsi="Calibri"/>
+                <w:b w:val="1"/>
+                <w:bCs w:val="1"/>
+                <w:color w:val="1a1a1a"/>
+                <w:sz w:val="17"/>
+                <w:szCs w:val="17"/>
+                <w:rtl w:val="0"/>
+              </w:rPr>
+              <w:t xml:space="preserve">Model</w:t>
+            </w:r>
+          </w:p>
+        </w:tc>
+        <w:tc>
+          <w:tcPr>
+            <w:tcBorders>
+              <w:top w:color="bfbfbf" w:space="0" w:sz="4" w:val="single"/>
+              <w:left w:color="bfbfbf" w:space="0" w:sz="4" w:val="single"/>
+              <w:bottom w:color="bfbfbf" w:space="0" w:sz="4" w:val="single"/>
+              <w:right w:color="bfbfbf" w:space="0" w:sz="4" w:val="single"/>
+            </w:tcBorders>
+            <w:shd w:fill="e7edf5" w:val="clear"/>
+            <w:tcMar>
+              <w:top w:w="50.0" w:type="dxa"/>
+              <w:left w:w="80.0" w:type="dxa"/>
+              <w:bottom w:w="50.0" w:type="dxa"/>
+              <w:right w:w="80.0" w:type="dxa"/>
+            </w:tcMar>
+            <w:vAlign w:val="top"/>
+          </w:tcPr>
+          <w:p>
+            <w:pPr>
+              <w:spacing w:line="240" w:lineRule="auto"/>
+              <w:rPr>
+                <w:rFonts w:ascii="Calibri" w:cs="Calibri" w:eastAsia="Calibri" w:hAnsi="Calibri"/>
+                <w:color w:val="1a1a1a"/>
+              </w:rPr>
+            </w:pPr>
+            <w:r>
+              <w:rPr>
+                <w:rFonts w:ascii="Calibri" w:cs="Calibri" w:eastAsia="Calibri" w:hAnsi="Calibri"/>
+                <w:b w:val="1"/>
+                <w:bCs w:val="1"/>
+                <w:color w:val="1a1a1a"/>
+                <w:sz w:val="17"/>
+                <w:szCs w:val="17"/>
+                <w:rtl w:val="0"/>
+              </w:rPr>
+              <w:t xml:space="preserve">Predictors</w:t>
+            </w:r>
+          </w:p>
+        </w:tc>
+        <w:tc>
+          <w:tcPr>
+            <w:tcBorders>
+              <w:top w:color="bfbfbf" w:space="0" w:sz="4" w:val="single"/>
+              <w:left w:color="bfbfbf" w:space="0" w:sz="4" w:val="single"/>
+              <w:bottom w:color="bfbfbf" w:space="0" w:sz="4" w:val="single"/>
+              <w:right w:color="bfbfbf" w:space="0" w:sz="4" w:val="single"/>
+            </w:tcBorders>
+            <w:shd w:fill="e7edf5" w:val="clear"/>
+            <w:tcMar>
+              <w:top w:w="50.0" w:type="dxa"/>
+              <w:left w:w="80.0" w:type="dxa"/>
+              <w:bottom w:w="50.0" w:type="dxa"/>
+              <w:right w:w="80.0" w:type="dxa"/>
+            </w:tcMar>
+            <w:vAlign w:val="top"/>
+          </w:tcPr>
+          <w:p>
+            <w:pPr>
+              <w:spacing w:line="240" w:lineRule="auto"/>
+              <w:rPr>
+                <w:rFonts w:ascii="Calibri" w:cs="Calibri" w:eastAsia="Calibri" w:hAnsi="Calibri"/>
+                <w:color w:val="1a1a1a"/>
+              </w:rPr>
+            </w:pPr>
+            <w:r>
+              <w:rPr>
+                <w:rFonts w:ascii="Calibri" w:cs="Calibri" w:eastAsia="Calibri" w:hAnsi="Calibri"/>
+                <w:b w:val="1"/>
+                <w:bCs w:val="1"/>
+                <w:color w:val="1a1a1a"/>
+                <w:sz w:val="17"/>
+                <w:szCs w:val="17"/>
+                <w:rtl w:val="0"/>
+              </w:rPr>
+              <w:t xml:space="preserve">Parameters</w:t>
+            </w:r>
+          </w:p>
+        </w:tc>
+        <w:tc>
+          <w:tcPr>
+            <w:tcBorders>
+              <w:top w:color="bfbfbf" w:space="0" w:sz="4" w:val="single"/>
+              <w:left w:color="bfbfbf" w:space="0" w:sz="4" w:val="single"/>
+              <w:bottom w:color="bfbfbf" w:space="0" w:sz="4" w:val="single"/>
+              <w:right w:color="bfbfbf" w:space="0" w:sz="4" w:val="single"/>
+            </w:tcBorders>
+            <w:shd w:fill="e7edf5" w:val="clear"/>
+            <w:tcMar>
+              <w:top w:w="50.0" w:type="dxa"/>
+              <w:left w:w="80.0" w:type="dxa"/>
+              <w:bottom w:w="50.0" w:type="dxa"/>
+              <w:right w:w="80.0" w:type="dxa"/>
+            </w:tcMar>
+            <w:vAlign w:val="top"/>
+          </w:tcPr>
+          <w:p>
+            <w:pPr>
+              <w:spacing w:line="240" w:lineRule="auto"/>
+              <w:rPr>
+                <w:rFonts w:ascii="Calibri" w:cs="Calibri" w:eastAsia="Calibri" w:hAnsi="Calibri"/>
+                <w:color w:val="1a1a1a"/>
+              </w:rPr>
+            </w:pPr>
+            <w:r>
+              <w:rPr>
+                <w:rFonts w:ascii="Calibri" w:cs="Calibri" w:eastAsia="Calibri" w:hAnsi="Calibri"/>
+                <w:b w:val="1"/>
+                <w:bCs w:val="1"/>
+                <w:color w:val="1a1a1a"/>
+                <w:sz w:val="17"/>
+                <w:szCs w:val="17"/>
+                <w:rtl w:val="0"/>
+              </w:rPr>
+              <w:t xml:space="preserve">AIC</w:t>
+            </w:r>
+          </w:p>
+        </w:tc>
+        <w:tc>
+          <w:tcPr>
+            <w:tcBorders>
+              <w:top w:color="bfbfbf" w:space="0" w:sz="4" w:val="single"/>
+              <w:left w:color="bfbfbf" w:space="0" w:sz="4" w:val="single"/>
+              <w:bottom w:color="bfbfbf" w:space="0" w:sz="4" w:val="single"/>
+              <w:right w:color="bfbfbf" w:space="0" w:sz="4" w:val="single"/>
+            </w:tcBorders>
+            <w:shd w:fill="e7edf5" w:val="clear"/>
+            <w:tcMar>
+              <w:top w:w="50.0" w:type="dxa"/>
+              <w:left w:w="80.0" w:type="dxa"/>
+              <w:bottom w:w="50.0" w:type="dxa"/>
+              <w:right w:w="80.0" w:type="dxa"/>
+            </w:tcMar>
+            <w:vAlign w:val="top"/>
+          </w:tcPr>
+          <w:p>
+            <w:pPr>
+              <w:spacing w:line="240" w:lineRule="auto"/>
+              <w:rPr>
+                <w:rFonts w:ascii="Calibri" w:cs="Calibri" w:eastAsia="Calibri" w:hAnsi="Calibri"/>
+                <w:color w:val="1a1a1a"/>
+              </w:rPr>
+            </w:pPr>
+            <w:r>
+              <w:rPr>
+                <w:rFonts w:ascii="Calibri" w:cs="Calibri" w:eastAsia="Calibri" w:hAnsi="Calibri"/>
+                <w:b w:val="1"/>
+                <w:bCs w:val="1"/>
+                <w:color w:val="1a1a1a"/>
+                <w:sz w:val="17"/>
+                <w:szCs w:val="17"/>
+                <w:rtl w:val="0"/>
+              </w:rPr>
+              <w:t xml:space="preserve">Result</w:t>
+            </w:r>
+          </w:p>
+        </w:tc>
+      </w:tr>
+      <w:tr>
+        <w:trPr>
+          <w:cantSplit w:val="1"/>
+          <w:tblHeader w:val="0"/>
+        </w:trPr>
+        <w:tc>
+          <w:tcPr>
+            <w:tcBorders>
+              <w:top w:color="bfbfbf" w:space="0" w:sz="4" w:val="single"/>
+              <w:left w:color="bfbfbf" w:space="0" w:sz="4" w:val="single"/>
+              <w:bottom w:color="bfbfbf" w:space="0" w:sz="4" w:val="single"/>
+              <w:right w:color="bfbfbf" w:space="0" w:sz="4" w:val="single"/>
+            </w:tcBorders>
+            <w:tcMar>
+              <w:top w:w="50.0" w:type="dxa"/>
+              <w:left w:w="80.0" w:type="dxa"/>
+              <w:bottom w:w="50.0" w:type="dxa"/>
+              <w:right w:w="80.0" w:type="dxa"/>
+            </w:tcMar>
+            <w:vAlign w:val="top"/>
+          </w:tcPr>
+          <w:p>
+            <w:pPr>
+              <w:spacing w:line="240" w:lineRule="auto"/>
+              <w:rPr>
+                <w:rFonts w:ascii="Calibri" w:cs="Calibri" w:eastAsia="Calibri" w:hAnsi="Calibri"/>
+                <w:color w:val="1a1a1a"/>
+              </w:rPr>
+            </w:pPr>
+            <w:r>
+              <w:rPr>
+                <w:rFonts w:ascii="Calibri" w:cs="Calibri" w:eastAsia="Calibri" w:hAnsi="Calibri"/>
+                <w:color w:val="1a1a1a"/>
+                <w:sz w:val="17"/>
+                <w:szCs w:val="17"/>
+                <w:rtl w:val="0"/>
+              </w:rPr>
+              <w:t xml:space="preserve">M1</w:t>
+            </w:r>
+          </w:p>
+        </w:tc>
+        <w:tc>
+          <w:tcPr>
+            <w:tcBorders>
+              <w:top w:color="bfbfbf" w:space="0" w:sz="4" w:val="single"/>
+              <w:left w:color="bfbfbf" w:space="0" w:sz="4" w:val="single"/>
+              <w:bottom w:color="bfbfbf" w:space="0" w:sz="4" w:val="single"/>
+              <w:right w:color="bfbfbf" w:space="0" w:sz="4" w:val="single"/>
+            </w:tcBorders>
+            <w:tcMar>
+              <w:top w:w="50.0" w:type="dxa"/>
+              <w:left w:w="80.0" w:type="dxa"/>
+              <w:bottom w:w="50.0" w:type="dxa"/>
+              <w:right w:w="80.0" w:type="dxa"/>
+            </w:tcMar>
+            <w:vAlign w:val="top"/>
+          </w:tcPr>
+          <w:p>
+            <w:pPr>
+              <w:spacing w:line="240" w:lineRule="auto"/>
+              <w:rPr>
+                <w:rFonts w:ascii="Calibri" w:cs="Calibri" w:eastAsia="Calibri" w:hAnsi="Calibri"/>
+                <w:color w:val="1a1a1a"/>
+              </w:rPr>
+            </w:pPr>
+            <w:r>
+              <w:rPr>
+                <w:rFonts w:ascii="Calibri" w:cs="Calibri" w:eastAsia="Calibri" w:hAnsi="Calibri"/>
+                <w:color w:val="1a1a1a"/>
+                <w:sz w:val="17"/>
+                <w:szCs w:val="17"/>
+                <w:rtl w:val="0"/>
+              </w:rPr>
+              <w:t xml:space="preserve">Customer profile: age group, job, marital, education, default_unk</w:t>
+            </w:r>
+          </w:p>
+        </w:tc>
+        <w:tc>
+          <w:tcPr>
+            <w:tcBorders>
+              <w:top w:color="bfbfbf" w:space="0" w:sz="4" w:val="single"/>
+              <w:left w:color="bfbfbf" w:space="0" w:sz="4" w:val="single"/>
+              <w:bottom w:color="bfbfbf" w:space="0" w:sz="4" w:val="single"/>
+              <w:right w:color="bfbfbf" w:space="0" w:sz="4" w:val="single"/>
+            </w:tcBorders>
+            <w:tcMar>
+              <w:top w:w="50.0" w:type="dxa"/>
+              <w:left w:w="80.0" w:type="dxa"/>
+              <w:bottom w:w="50.0" w:type="dxa"/>
+              <w:right w:w="80.0" w:type="dxa"/>
+            </w:tcMar>
+            <w:vAlign w:val="top"/>
+          </w:tcPr>
+          <w:p>
+            <w:pPr>
+              <w:spacing w:line="240" w:lineRule="auto"/>
+              <w:rPr>
+                <w:rFonts w:ascii="Calibri" w:cs="Calibri" w:eastAsia="Calibri" w:hAnsi="Calibri"/>
+                <w:color w:val="1a1a1a"/>
+              </w:rPr>
+            </w:pPr>
+            <w:r>
+              <w:rPr>
+                <w:rFonts w:ascii="Calibri" w:cs="Calibri" w:eastAsia="Calibri" w:hAnsi="Calibri"/>
+                <w:color w:val="1a1a1a"/>
+                <w:sz w:val="17"/>
+                <w:szCs w:val="17"/>
+                <w:rtl w:val="0"/>
+              </w:rPr>
+              <w:t xml:space="preserve">27</w:t>
+            </w:r>
+          </w:p>
+        </w:tc>
+        <w:tc>
+          <w:tcPr>
+            <w:tcBorders>
+              <w:top w:color="bfbfbf" w:space="0" w:sz="4" w:val="single"/>
+              <w:left w:color="bfbfbf" w:space="0" w:sz="4" w:val="single"/>
+              <w:bottom w:color="bfbfbf" w:space="0" w:sz="4" w:val="single"/>
+              <w:right w:color="bfbfbf" w:space="0" w:sz="4" w:val="single"/>
+            </w:tcBorders>
+            <w:tcMar>
+              <w:top w:w="50.0" w:type="dxa"/>
+              <w:left w:w="80.0" w:type="dxa"/>
+              <w:bottom w:w="50.0" w:type="dxa"/>
+              <w:right w:w="80.0" w:type="dxa"/>
+            </w:tcMar>
+            <w:vAlign w:val="top"/>
+          </w:tcPr>
+          <w:p>
+            <w:pPr>
+              <w:spacing w:line="240" w:lineRule="auto"/>
+              <w:rPr>
+                <w:rFonts w:ascii="Calibri" w:cs="Calibri" w:eastAsia="Calibri" w:hAnsi="Calibri"/>
+                <w:color w:val="1a1a1a"/>
+              </w:rPr>
+            </w:pPr>
+            <w:r>
+              <w:rPr>
+                <w:rFonts w:ascii="Calibri" w:cs="Calibri" w:eastAsia="Calibri" w:hAnsi="Calibri"/>
+                <w:color w:val="1a1a1a"/>
+                <w:sz w:val="17"/>
+                <w:szCs w:val="17"/>
+                <w:rtl w:val="0"/>
+              </w:rPr>
+              <w:t xml:space="preserve">21,961.2</w:t>
+            </w:r>
+          </w:p>
+        </w:tc>
+        <w:tc>
+          <w:tcPr>
+            <w:tcBorders>
+              <w:top w:color="bfbfbf" w:space="0" w:sz="4" w:val="single"/>
+              <w:left w:color="bfbfbf" w:space="0" w:sz="4" w:val="single"/>
+              <w:bottom w:color="bfbfbf" w:space="0" w:sz="4" w:val="single"/>
+              <w:right w:color="bfbfbf" w:space="0" w:sz="4" w:val="single"/>
+            </w:tcBorders>
+            <w:tcMar>
+              <w:top w:w="50.0" w:type="dxa"/>
+              <w:left w:w="80.0" w:type="dxa"/>
+              <w:bottom w:w="50.0" w:type="dxa"/>
+              <w:right w:w="80.0" w:type="dxa"/>
+            </w:tcMar>
+            <w:vAlign w:val="top"/>
+          </w:tcPr>
+          <w:p>
+            <w:pPr>
+              <w:spacing w:line="240" w:lineRule="auto"/>
+              <w:rPr>
+                <w:rFonts w:ascii="Calibri" w:cs="Calibri" w:eastAsia="Calibri" w:hAnsi="Calibri"/>
+                <w:color w:val="1a1a1a"/>
+              </w:rPr>
+            </w:pPr>
+            <w:r>
+              <w:rPr>
+                <w:rFonts w:ascii="Calibri" w:cs="Calibri" w:eastAsia="Calibri" w:hAnsi="Calibri"/>
+                <w:color w:val="1a1a1a"/>
+                <w:sz w:val="17"/>
+                <w:szCs w:val="17"/>
+                <w:rtl w:val="0"/>
+              </w:rPr>
+              <w:t xml:space="preserve">Baseline</w:t>
+            </w:r>
+          </w:p>
+        </w:tc>
+      </w:tr>
+      <w:tr>
+        <w:trPr>
+          <w:cantSplit w:val="1"/>
+          <w:tblHeader w:val="0"/>
+        </w:trPr>
+        <w:tc>
+          <w:tcPr>
+            <w:tcBorders>
+              <w:top w:color="bfbfbf" w:space="0" w:sz="4" w:val="single"/>
+              <w:left w:color="bfbfbf" w:space="0" w:sz="4" w:val="single"/>
+              <w:bottom w:color="bfbfbf" w:space="0" w:sz="4" w:val="single"/>
+              <w:right w:color="bfbfbf" w:space="0" w:sz="4" w:val="single"/>
+            </w:tcBorders>
+            <w:tcMar>
+              <w:top w:w="50.0" w:type="dxa"/>
+              <w:left w:w="80.0" w:type="dxa"/>
+              <w:bottom w:w="50.0" w:type="dxa"/>
+              <w:right w:w="80.0" w:type="dxa"/>
+            </w:tcMar>
+            <w:vAlign w:val="top"/>
+          </w:tcPr>
+          <w:p>
+            <w:pPr>
+              <w:spacing w:line="240" w:lineRule="auto"/>
+              <w:rPr>
+                <w:rFonts w:ascii="Calibri" w:cs="Calibri" w:eastAsia="Calibri" w:hAnsi="Calibri"/>
+                <w:color w:val="1a1a1a"/>
+              </w:rPr>
+            </w:pPr>
+            <w:r>
+              <w:rPr>
+                <w:rFonts w:ascii="Calibri" w:cs="Calibri" w:eastAsia="Calibri" w:hAnsi="Calibri"/>
+                <w:color w:val="1a1a1a"/>
+                <w:sz w:val="17"/>
+                <w:szCs w:val="17"/>
+                <w:rtl w:val="0"/>
+              </w:rPr>
+              <w:t xml:space="preserve">M2</w:t>
+            </w:r>
+          </w:p>
+        </w:tc>
+        <w:tc>
+          <w:tcPr>
+            <w:tcBorders>
+              <w:top w:color="bfbfbf" w:space="0" w:sz="4" w:val="single"/>
+              <w:left w:color="bfbfbf" w:space="0" w:sz="4" w:val="single"/>
+              <w:bottom w:color="bfbfbf" w:space="0" w:sz="4" w:val="single"/>
+              <w:right w:color="bfbfbf" w:space="0" w:sz="4" w:val="single"/>
+            </w:tcBorders>
+            <w:tcMar>
+              <w:top w:w="50.0" w:type="dxa"/>
+              <w:left w:w="80.0" w:type="dxa"/>
+              <w:bottom w:w="50.0" w:type="dxa"/>
+              <w:right w:w="80.0" w:type="dxa"/>
+            </w:tcMar>
+            <w:vAlign w:val="top"/>
+          </w:tcPr>
+          <w:p>
+            <w:pPr>
+              <w:spacing w:line="240" w:lineRule="auto"/>
+              <w:rPr>
+                <w:rFonts w:ascii="Calibri" w:cs="Calibri" w:eastAsia="Calibri" w:hAnsi="Calibri"/>
+                <w:color w:val="1a1a1a"/>
+              </w:rPr>
+            </w:pPr>
+            <w:r>
+              <w:rPr>
+                <w:rFonts w:ascii="Calibri" w:cs="Calibri" w:eastAsia="Calibri" w:hAnsi="Calibri"/>
+                <w:color w:val="1a1a1a"/>
+                <w:sz w:val="17"/>
+                <w:szCs w:val="17"/>
+                <w:rtl w:val="0"/>
+              </w:rPr>
+              <w:t xml:space="preserve">M1 + contact history: contact, poutcome, log2(campaign)</w:t>
+            </w:r>
+          </w:p>
+        </w:tc>
+        <w:tc>
+          <w:tcPr>
+            <w:tcBorders>
+              <w:top w:color="bfbfbf" w:space="0" w:sz="4" w:val="single"/>
+              <w:left w:color="bfbfbf" w:space="0" w:sz="4" w:val="single"/>
+              <w:bottom w:color="bfbfbf" w:space="0" w:sz="4" w:val="single"/>
+              <w:right w:color="bfbfbf" w:space="0" w:sz="4" w:val="single"/>
+            </w:tcBorders>
+            <w:tcMar>
+              <w:top w:w="50.0" w:type="dxa"/>
+              <w:left w:w="80.0" w:type="dxa"/>
+              <w:bottom w:w="50.0" w:type="dxa"/>
+              <w:right w:w="80.0" w:type="dxa"/>
+            </w:tcMar>
+            <w:vAlign w:val="top"/>
+          </w:tcPr>
+          <w:p>
+            <w:pPr>
+              <w:spacing w:line="240" w:lineRule="auto"/>
+              <w:rPr>
+                <w:rFonts w:ascii="Calibri" w:cs="Calibri" w:eastAsia="Calibri" w:hAnsi="Calibri"/>
+                <w:color w:val="1a1a1a"/>
+              </w:rPr>
+            </w:pPr>
+            <w:r>
+              <w:rPr>
+                <w:rFonts w:ascii="Calibri" w:cs="Calibri" w:eastAsia="Calibri" w:hAnsi="Calibri"/>
+                <w:color w:val="1a1a1a"/>
+                <w:sz w:val="17"/>
+                <w:szCs w:val="17"/>
+                <w:rtl w:val="0"/>
+              </w:rPr>
+              <w:t xml:space="preserve">31</w:t>
+            </w:r>
+          </w:p>
+        </w:tc>
+        <w:tc>
+          <w:tcPr>
+            <w:tcBorders>
+              <w:top w:color="bfbfbf" w:space="0" w:sz="4" w:val="single"/>
+              <w:left w:color="bfbfbf" w:space="0" w:sz="4" w:val="single"/>
+              <w:bottom w:color="bfbfbf" w:space="0" w:sz="4" w:val="single"/>
+              <w:right w:color="bfbfbf" w:space="0" w:sz="4" w:val="single"/>
+            </w:tcBorders>
+            <w:tcMar>
+              <w:top w:w="50.0" w:type="dxa"/>
+              <w:left w:w="80.0" w:type="dxa"/>
+              <w:bottom w:w="50.0" w:type="dxa"/>
+              <w:right w:w="80.0" w:type="dxa"/>
+            </w:tcMar>
+            <w:vAlign w:val="top"/>
+          </w:tcPr>
+          <w:p>
+            <w:pPr>
+              <w:spacing w:line="240" w:lineRule="auto"/>
+              <w:rPr>
+                <w:rFonts w:ascii="Calibri" w:cs="Calibri" w:eastAsia="Calibri" w:hAnsi="Calibri"/>
+                <w:color w:val="1a1a1a"/>
+              </w:rPr>
+            </w:pPr>
+            <w:r>
+              <w:rPr>
+                <w:rFonts w:ascii="Calibri" w:cs="Calibri" w:eastAsia="Calibri" w:hAnsi="Calibri"/>
+                <w:color w:val="1a1a1a"/>
+                <w:sz w:val="17"/>
+                <w:szCs w:val="17"/>
+                <w:rtl w:val="0"/>
+              </w:rPr>
+              <w:t xml:space="preserve">20,142.5</w:t>
+            </w:r>
+          </w:p>
+        </w:tc>
+        <w:tc>
+          <w:tcPr>
+            <w:tcBorders>
+              <w:top w:color="bfbfbf" w:space="0" w:sz="4" w:val="single"/>
+              <w:left w:color="bfbfbf" w:space="0" w:sz="4" w:val="single"/>
+              <w:bottom w:color="bfbfbf" w:space="0" w:sz="4" w:val="single"/>
+              <w:right w:color="bfbfbf" w:space="0" w:sz="4" w:val="single"/>
+            </w:tcBorders>
+            <w:tcMar>
+              <w:top w:w="50.0" w:type="dxa"/>
+              <w:left w:w="80.0" w:type="dxa"/>
+              <w:bottom w:w="50.0" w:type="dxa"/>
+              <w:right w:w="80.0" w:type="dxa"/>
+            </w:tcMar>
+            <w:vAlign w:val="top"/>
+          </w:tcPr>
+          <w:p>
+            <w:pPr>
+              <w:spacing w:line="240" w:lineRule="auto"/>
+              <w:rPr>
+                <w:rFonts w:ascii="Calibri" w:cs="Calibri" w:eastAsia="Calibri" w:hAnsi="Calibri"/>
+                <w:color w:val="1a1a1a"/>
+              </w:rPr>
+            </w:pPr>
+            <w:r>
+              <w:rPr>
+                <w:rFonts w:ascii="Calibri" w:cs="Calibri" w:eastAsia="Calibri" w:hAnsi="Calibri"/>
+                <w:color w:val="1a1a1a"/>
+                <w:sz w:val="17"/>
+                <w:szCs w:val="17"/>
+                <w:rtl w:val="0"/>
+              </w:rPr>
+              <w:t xml:space="preserve">Better than M1 (LRT p &lt; 0.001)</w:t>
+            </w:r>
+          </w:p>
+        </w:tc>
+      </w:tr>
+      <w:tr>
+        <w:trPr>
+          <w:cantSplit w:val="1"/>
+          <w:tblHeader w:val="0"/>
+        </w:trPr>
+        <w:tc>
+          <w:tcPr>
+            <w:tcBorders>
+              <w:top w:color="bfbfbf" w:space="0" w:sz="4" w:val="single"/>
+              <w:left w:color="bfbfbf" w:space="0" w:sz="4" w:val="single"/>
+              <w:bottom w:color="bfbfbf" w:space="0" w:sz="4" w:val="single"/>
+              <w:right w:color="bfbfbf" w:space="0" w:sz="4" w:val="single"/>
+            </w:tcBorders>
+            <w:tcMar>
+              <w:top w:w="50.0" w:type="dxa"/>
+              <w:left w:w="80.0" w:type="dxa"/>
+              <w:bottom w:w="50.0" w:type="dxa"/>
+              <w:right w:w="80.0" w:type="dxa"/>
+            </w:tcMar>
+            <w:vAlign w:val="top"/>
+          </w:tcPr>
+          <w:p>
+            <w:pPr>
+              <w:spacing w:line="240" w:lineRule="auto"/>
+              <w:rPr>
+                <w:rFonts w:ascii="Calibri" w:cs="Calibri" w:eastAsia="Calibri" w:hAnsi="Calibri"/>
+                <w:color w:val="1a1a1a"/>
+              </w:rPr>
+            </w:pPr>
+            <w:r>
+              <w:rPr>
+                <w:rFonts w:ascii="Calibri" w:cs="Calibri" w:eastAsia="Calibri" w:hAnsi="Calibri"/>
+                <w:color w:val="1a1a1a"/>
+                <w:sz w:val="17"/>
+                <w:szCs w:val="17"/>
+                <w:rtl w:val="0"/>
+              </w:rPr>
+              <w:t xml:space="preserve">M3</w:t>
+            </w:r>
+          </w:p>
+        </w:tc>
+        <w:tc>
+          <w:tcPr>
+            <w:tcBorders>
+              <w:top w:color="bfbfbf" w:space="0" w:sz="4" w:val="single"/>
+              <w:left w:color="bfbfbf" w:space="0" w:sz="4" w:val="single"/>
+              <w:bottom w:color="bfbfbf" w:space="0" w:sz="4" w:val="single"/>
+              <w:right w:color="bfbfbf" w:space="0" w:sz="4" w:val="single"/>
+            </w:tcBorders>
+            <w:tcMar>
+              <w:top w:w="50.0" w:type="dxa"/>
+              <w:left w:w="80.0" w:type="dxa"/>
+              <w:bottom w:w="50.0" w:type="dxa"/>
+              <w:right w:w="80.0" w:type="dxa"/>
+            </w:tcMar>
+            <w:vAlign w:val="top"/>
+          </w:tcPr>
+          <w:p>
+            <w:pPr>
+              <w:spacing w:line="240" w:lineRule="auto"/>
+              <w:rPr>
+                <w:rFonts w:ascii="Calibri" w:cs="Calibri" w:eastAsia="Calibri" w:hAnsi="Calibri"/>
+                <w:color w:val="1a1a1a"/>
+              </w:rPr>
+            </w:pPr>
+            <w:r>
+              <w:rPr>
+                <w:rFonts w:ascii="Calibri" w:cs="Calibri" w:eastAsia="Calibri" w:hAnsi="Calibri"/>
+                <w:color w:val="1a1a1a"/>
+                <w:sz w:val="17"/>
+                <w:szCs w:val="17"/>
+                <w:rtl w:val="0"/>
+              </w:rPr>
+              <w:t xml:space="preserve">M2 + economy: nr.employed, cons.price.idx, cons.conf.idx</w:t>
+            </w:r>
+          </w:p>
+        </w:tc>
+        <w:tc>
+          <w:tcPr>
+            <w:tcBorders>
+              <w:top w:color="bfbfbf" w:space="0" w:sz="4" w:val="single"/>
+              <w:left w:color="bfbfbf" w:space="0" w:sz="4" w:val="single"/>
+              <w:bottom w:color="bfbfbf" w:space="0" w:sz="4" w:val="single"/>
+              <w:right w:color="bfbfbf" w:space="0" w:sz="4" w:val="single"/>
+            </w:tcBorders>
+            <w:tcMar>
+              <w:top w:w="50.0" w:type="dxa"/>
+              <w:left w:w="80.0" w:type="dxa"/>
+              <w:bottom w:w="50.0" w:type="dxa"/>
+              <w:right w:w="80.0" w:type="dxa"/>
+            </w:tcMar>
+            <w:vAlign w:val="top"/>
+          </w:tcPr>
+          <w:p>
+            <w:pPr>
+              <w:spacing w:line="240" w:lineRule="auto"/>
+              <w:rPr>
+                <w:rFonts w:ascii="Calibri" w:cs="Calibri" w:eastAsia="Calibri" w:hAnsi="Calibri"/>
+                <w:color w:val="1a1a1a"/>
+              </w:rPr>
+            </w:pPr>
+            <w:r>
+              <w:rPr>
+                <w:rFonts w:ascii="Calibri" w:cs="Calibri" w:eastAsia="Calibri" w:hAnsi="Calibri"/>
+                <w:color w:val="1a1a1a"/>
+                <w:sz w:val="17"/>
+                <w:szCs w:val="17"/>
+                <w:rtl w:val="0"/>
+              </w:rPr>
+              <w:t xml:space="preserve">34</w:t>
+            </w:r>
+          </w:p>
+        </w:tc>
+        <w:tc>
+          <w:tcPr>
+            <w:tcBorders>
+              <w:top w:color="bfbfbf" w:space="0" w:sz="4" w:val="single"/>
+              <w:left w:color="bfbfbf" w:space="0" w:sz="4" w:val="single"/>
+              <w:bottom w:color="bfbfbf" w:space="0" w:sz="4" w:val="single"/>
+              <w:right w:color="bfbfbf" w:space="0" w:sz="4" w:val="single"/>
+            </w:tcBorders>
+            <w:tcMar>
+              <w:top w:w="50.0" w:type="dxa"/>
+              <w:left w:w="80.0" w:type="dxa"/>
+              <w:bottom w:w="50.0" w:type="dxa"/>
+              <w:right w:w="80.0" w:type="dxa"/>
+            </w:tcMar>
+            <w:vAlign w:val="top"/>
+          </w:tcPr>
+          <w:p>
+            <w:pPr>
+              <w:spacing w:line="240" w:lineRule="auto"/>
+              <w:rPr>
+                <w:rFonts w:ascii="Calibri" w:cs="Calibri" w:eastAsia="Calibri" w:hAnsi="Calibri"/>
+                <w:color w:val="1a1a1a"/>
+              </w:rPr>
+            </w:pPr>
+            <w:r>
+              <w:rPr>
+                <w:rFonts w:ascii="Calibri" w:cs="Calibri" w:eastAsia="Calibri" w:hAnsi="Calibri"/>
+                <w:color w:val="1a1a1a"/>
+                <w:sz w:val="17"/>
+                <w:szCs w:val="17"/>
+                <w:rtl w:val="0"/>
+              </w:rPr>
+              <w:t xml:space="preserve">18,816.4</w:t>
+            </w:r>
+          </w:p>
+        </w:tc>
+        <w:tc>
+          <w:tcPr>
+            <w:tcBorders>
+              <w:top w:color="bfbfbf" w:space="0" w:sz="4" w:val="single"/>
+              <w:left w:color="bfbfbf" w:space="0" w:sz="4" w:val="single"/>
+              <w:bottom w:color="bfbfbf" w:space="0" w:sz="4" w:val="single"/>
+              <w:right w:color="bfbfbf" w:space="0" w:sz="4" w:val="single"/>
+            </w:tcBorders>
+            <w:tcMar>
+              <w:top w:w="50.0" w:type="dxa"/>
+              <w:left w:w="80.0" w:type="dxa"/>
+              <w:bottom w:w="50.0" w:type="dxa"/>
+              <w:right w:w="80.0" w:type="dxa"/>
+            </w:tcMar>
+            <w:vAlign w:val="top"/>
+          </w:tcPr>
+          <w:p>
+            <w:pPr>
+              <w:spacing w:line="240" w:lineRule="auto"/>
+              <w:rPr>
+                <w:rFonts w:ascii="Calibri" w:cs="Calibri" w:eastAsia="Calibri" w:hAnsi="Calibri"/>
+                <w:color w:val="1a1a1a"/>
+              </w:rPr>
+            </w:pPr>
+            <w:r>
+              <w:rPr>
+                <w:rFonts w:ascii="Calibri" w:cs="Calibri" w:eastAsia="Calibri" w:hAnsi="Calibri"/>
+                <w:color w:val="1a1a1a"/>
+                <w:sz w:val="17"/>
+                <w:szCs w:val="17"/>
+                <w:rtl w:val="0"/>
+              </w:rPr>
+              <w:t xml:space="preserve">Better than M2 (LRT p &lt; 0.001)</w:t>
+            </w:r>
+          </w:p>
+        </w:tc>
+      </w:tr>
+      <w:tr>
+        <w:trPr>
+          <w:cantSplit w:val="1"/>
+          <w:tblHeader w:val="0"/>
+        </w:trPr>
+        <w:tc>
+          <w:tcPr>
+            <w:tcBorders>
+              <w:top w:color="bfbfbf" w:space="0" w:sz="4" w:val="single"/>
+              <w:left w:color="bfbfbf" w:space="0" w:sz="4" w:val="single"/>
+              <w:bottom w:color="bfbfbf" w:space="0" w:sz="4" w:val="single"/>
+              <w:right w:color="bfbfbf" w:space="0" w:sz="4" w:val="single"/>
+            </w:tcBorders>
+            <w:tcMar>
+              <w:top w:w="50.0" w:type="dxa"/>
+              <w:left w:w="80.0" w:type="dxa"/>
+              <w:bottom w:w="50.0" w:type="dxa"/>
+              <w:right w:w="80.0" w:type="dxa"/>
+            </w:tcMar>
+            <w:vAlign w:val="top"/>
+          </w:tcPr>
+          <w:p>
+            <w:pPr>
+              <w:spacing w:line="240" w:lineRule="auto"/>
+              <w:rPr>
+                <w:rFonts w:ascii="Calibri" w:cs="Calibri" w:eastAsia="Calibri" w:hAnsi="Calibri"/>
+                <w:color w:val="1a1a1a"/>
+              </w:rPr>
+            </w:pPr>
+            <w:r>
+              <w:rPr>
+                <w:rFonts w:ascii="Calibri" w:cs="Calibri" w:eastAsia="Calibri" w:hAnsi="Calibri"/>
+                <w:color w:val="1a1a1a"/>
+                <w:sz w:val="17"/>
+                <w:szCs w:val="17"/>
+                <w:rtl w:val="0"/>
+              </w:rPr>
+              <w:t xml:space="preserve">M4</w:t>
+            </w:r>
+          </w:p>
+        </w:tc>
+        <w:tc>
+          <w:tcPr>
+            <w:tcBorders>
+              <w:top w:color="bfbfbf" w:space="0" w:sz="4" w:val="single"/>
+              <w:left w:color="bfbfbf" w:space="0" w:sz="4" w:val="single"/>
+              <w:bottom w:color="bfbfbf" w:space="0" w:sz="4" w:val="single"/>
+              <w:right w:color="bfbfbf" w:space="0" w:sz="4" w:val="single"/>
+            </w:tcBorders>
+            <w:tcMar>
+              <w:top w:w="50.0" w:type="dxa"/>
+              <w:left w:w="80.0" w:type="dxa"/>
+              <w:bottom w:w="50.0" w:type="dxa"/>
+              <w:right w:w="80.0" w:type="dxa"/>
+            </w:tcMar>
+            <w:vAlign w:val="top"/>
+          </w:tcPr>
+          <w:p>
+            <w:pPr>
+              <w:spacing w:line="240" w:lineRule="auto"/>
+              <w:rPr>
+                <w:rFonts w:ascii="Calibri" w:cs="Calibri" w:eastAsia="Calibri" w:hAnsi="Calibri"/>
+                <w:color w:val="1a1a1a"/>
+              </w:rPr>
+            </w:pPr>
+            <w:r>
+              <w:rPr>
+                <w:rFonts w:ascii="Calibri" w:cs="Calibri" w:eastAsia="Calibri" w:hAnsi="Calibri"/>
+                <w:color w:val="1a1a1a"/>
+                <w:sz w:val="17"/>
+                <w:szCs w:val="17"/>
+                <w:rtl w:val="0"/>
+              </w:rPr>
+              <w:t xml:space="preserve">M3 + timing: month, day_of_week</w:t>
+            </w:r>
+          </w:p>
+        </w:tc>
+        <w:tc>
+          <w:tcPr>
+            <w:tcBorders>
+              <w:top w:color="bfbfbf" w:space="0" w:sz="4" w:val="single"/>
+              <w:left w:color="bfbfbf" w:space="0" w:sz="4" w:val="single"/>
+              <w:bottom w:color="bfbfbf" w:space="0" w:sz="4" w:val="single"/>
+              <w:right w:color="bfbfbf" w:space="0" w:sz="4" w:val="single"/>
+            </w:tcBorders>
+            <w:tcMar>
+              <w:top w:w="50.0" w:type="dxa"/>
+              <w:left w:w="80.0" w:type="dxa"/>
+              <w:bottom w:w="50.0" w:type="dxa"/>
+              <w:right w:w="80.0" w:type="dxa"/>
+            </w:tcMar>
+            <w:vAlign w:val="top"/>
+          </w:tcPr>
+          <w:p>
+            <w:pPr>
+              <w:spacing w:line="240" w:lineRule="auto"/>
+              <w:rPr>
+                <w:rFonts w:ascii="Calibri" w:cs="Calibri" w:eastAsia="Calibri" w:hAnsi="Calibri"/>
+                <w:color w:val="1a1a1a"/>
+              </w:rPr>
+            </w:pPr>
+            <w:r>
+              <w:rPr>
+                <w:rFonts w:ascii="Calibri" w:cs="Calibri" w:eastAsia="Calibri" w:hAnsi="Calibri"/>
+                <w:color w:val="1a1a1a"/>
+                <w:sz w:val="17"/>
+                <w:szCs w:val="17"/>
+                <w:rtl w:val="0"/>
+              </w:rPr>
+              <w:t xml:space="preserve">47</w:t>
+            </w:r>
+          </w:p>
+        </w:tc>
+        <w:tc>
+          <w:tcPr>
+            <w:tcBorders>
+              <w:top w:color="bfbfbf" w:space="0" w:sz="4" w:val="single"/>
+              <w:left w:color="bfbfbf" w:space="0" w:sz="4" w:val="single"/>
+              <w:bottom w:color="bfbfbf" w:space="0" w:sz="4" w:val="single"/>
+              <w:right w:color="bfbfbf" w:space="0" w:sz="4" w:val="single"/>
+            </w:tcBorders>
+            <w:tcMar>
+              <w:top w:w="50.0" w:type="dxa"/>
+              <w:left w:w="80.0" w:type="dxa"/>
+              <w:bottom w:w="50.0" w:type="dxa"/>
+              <w:right w:w="80.0" w:type="dxa"/>
+            </w:tcMar>
+            <w:vAlign w:val="top"/>
+          </w:tcPr>
+          <w:p>
+            <w:pPr>
+              <w:spacing w:line="240" w:lineRule="auto"/>
+              <w:rPr>
+                <w:rFonts w:ascii="Calibri" w:cs="Calibri" w:eastAsia="Calibri" w:hAnsi="Calibri"/>
+                <w:color w:val="1a1a1a"/>
+              </w:rPr>
+            </w:pPr>
+            <w:r>
+              <w:rPr>
+                <w:rFonts w:ascii="Calibri" w:cs="Calibri" w:eastAsia="Calibri" w:hAnsi="Calibri"/>
+                <w:color w:val="1a1a1a"/>
+                <w:sz w:val="17"/>
+                <w:szCs w:val="17"/>
+                <w:rtl w:val="0"/>
+              </w:rPr>
+              <w:t xml:space="preserve">18,484.4</w:t>
+            </w:r>
+          </w:p>
+        </w:tc>
+        <w:tc>
+          <w:tcPr>
+            <w:tcBorders>
+              <w:top w:color="bfbfbf" w:space="0" w:sz="4" w:val="single"/>
+              <w:left w:color="bfbfbf" w:space="0" w:sz="4" w:val="single"/>
+              <w:bottom w:color="bfbfbf" w:space="0" w:sz="4" w:val="single"/>
+              <w:right w:color="bfbfbf" w:space="0" w:sz="4" w:val="single"/>
+            </w:tcBorders>
+            <w:tcMar>
+              <w:top w:w="50.0" w:type="dxa"/>
+              <w:left w:w="80.0" w:type="dxa"/>
+              <w:bottom w:w="50.0" w:type="dxa"/>
+              <w:right w:w="80.0" w:type="dxa"/>
+            </w:tcMar>
+            <w:vAlign w:val="top"/>
+          </w:tcPr>
+          <w:p>
+            <w:pPr>
+              <w:spacing w:line="240" w:lineRule="auto"/>
+              <w:rPr>
+                <w:rFonts w:ascii="Calibri" w:cs="Calibri" w:eastAsia="Calibri" w:hAnsi="Calibri"/>
+                <w:color w:val="1a1a1a"/>
+              </w:rPr>
+            </w:pPr>
+            <w:r>
+              <w:rPr>
+                <w:rFonts w:ascii="Calibri" w:cs="Calibri" w:eastAsia="Calibri" w:hAnsi="Calibri"/>
+                <w:color w:val="1a1a1a"/>
+                <w:sz w:val="17"/>
+                <w:szCs w:val="17"/>
+                <w:rtl w:val="0"/>
+              </w:rPr>
+              <w:t xml:space="preserve">Better than M3 (LRT p &lt; 0.001); final model</w:t>
+            </w:r>
+          </w:p>
+        </w:tc>
+      </w:tr>
+      <w:tr>
+        <w:trPr>
+          <w:cantSplit w:val="1"/>
+          <w:tblHeader w:val="0"/>
+        </w:trPr>
+        <w:tc>
+          <w:tcPr>
+            <w:tcBorders>
+              <w:top w:color="bfbfbf" w:space="0" w:sz="4" w:val="single"/>
+              <w:left w:color="bfbfbf" w:space="0" w:sz="4" w:val="single"/>
+              <w:bottom w:color="bfbfbf" w:space="0" w:sz="4" w:val="single"/>
+              <w:right w:color="bfbfbf" w:space="0" w:sz="4" w:val="single"/>
+            </w:tcBorders>
+            <w:tcMar>
+              <w:top w:w="50.0" w:type="dxa"/>
+              <w:left w:w="80.0" w:type="dxa"/>
+              <w:bottom w:w="50.0" w:type="dxa"/>
+              <w:right w:w="80.0" w:type="dxa"/>
+            </w:tcMar>
+            <w:vAlign w:val="top"/>
+          </w:tcPr>
+          <w:p>
+            <w:pPr>
+              <w:spacing w:line="240" w:lineRule="auto"/>
+              <w:rPr>
+                <w:rFonts w:ascii="Calibri" w:cs="Calibri" w:eastAsia="Calibri" w:hAnsi="Calibri"/>
+                <w:color w:val="1a1a1a"/>
+              </w:rPr>
+            </w:pPr>
+            <w:r>
+              <w:rPr>
+                <w:rFonts w:ascii="Calibri" w:cs="Calibri" w:eastAsia="Calibri" w:hAnsi="Calibri"/>
+                <w:color w:val="1a1a1a"/>
+                <w:sz w:val="17"/>
+                <w:szCs w:val="17"/>
+                <w:rtl w:val="0"/>
+              </w:rPr>
+              <w:t xml:space="preserve">M5</w:t>
+            </w:r>
+          </w:p>
+        </w:tc>
+        <w:tc>
+          <w:tcPr>
+            <w:tcBorders>
+              <w:top w:color="bfbfbf" w:space="0" w:sz="4" w:val="single"/>
+              <w:left w:color="bfbfbf" w:space="0" w:sz="4" w:val="single"/>
+              <w:bottom w:color="bfbfbf" w:space="0" w:sz="4" w:val="single"/>
+              <w:right w:color="bfbfbf" w:space="0" w:sz="4" w:val="single"/>
+            </w:tcBorders>
+            <w:tcMar>
+              <w:top w:w="50.0" w:type="dxa"/>
+              <w:left w:w="80.0" w:type="dxa"/>
+              <w:bottom w:w="50.0" w:type="dxa"/>
+              <w:right w:w="80.0" w:type="dxa"/>
+            </w:tcMar>
+            <w:vAlign w:val="top"/>
+          </w:tcPr>
+          <w:p>
+            <w:pPr>
+              <w:spacing w:line="240" w:lineRule="auto"/>
+              <w:rPr>
+                <w:rFonts w:ascii="Calibri" w:cs="Calibri" w:eastAsia="Calibri" w:hAnsi="Calibri"/>
+                <w:color w:val="1a1a1a"/>
+              </w:rPr>
+            </w:pPr>
+            <w:r>
+              <w:rPr>
+                <w:rFonts w:ascii="Calibri" w:cs="Calibri" w:eastAsia="Calibri" w:hAnsi="Calibri"/>
+                <w:color w:val="1a1a1a"/>
+                <w:sz w:val="17"/>
+                <w:szCs w:val="17"/>
+                <w:rtl w:val="0"/>
+              </w:rPr>
+              <w:t xml:space="preserve">M4 + interaction contact × poutcome</w:t>
+            </w:r>
+          </w:p>
+        </w:tc>
+        <w:tc>
+          <w:tcPr>
+            <w:tcBorders>
+              <w:top w:color="bfbfbf" w:space="0" w:sz="4" w:val="single"/>
+              <w:left w:color="bfbfbf" w:space="0" w:sz="4" w:val="single"/>
+              <w:bottom w:color="bfbfbf" w:space="0" w:sz="4" w:val="single"/>
+              <w:right w:color="bfbfbf" w:space="0" w:sz="4" w:val="single"/>
+            </w:tcBorders>
+            <w:tcMar>
+              <w:top w:w="50.0" w:type="dxa"/>
+              <w:left w:w="80.0" w:type="dxa"/>
+              <w:bottom w:w="50.0" w:type="dxa"/>
+              <w:right w:w="80.0" w:type="dxa"/>
+            </w:tcMar>
+            <w:vAlign w:val="top"/>
+          </w:tcPr>
+          <w:p>
+            <w:pPr>
+              <w:spacing w:line="240" w:lineRule="auto"/>
+              <w:rPr>
+                <w:rFonts w:ascii="Calibri" w:cs="Calibri" w:eastAsia="Calibri" w:hAnsi="Calibri"/>
+                <w:color w:val="1a1a1a"/>
+              </w:rPr>
+            </w:pPr>
+            <w:r>
+              <w:rPr>
+                <w:rFonts w:ascii="Calibri" w:cs="Calibri" w:eastAsia="Calibri" w:hAnsi="Calibri"/>
+                <w:color w:val="1a1a1a"/>
+                <w:sz w:val="17"/>
+                <w:szCs w:val="17"/>
+                <w:rtl w:val="0"/>
+              </w:rPr>
+              <w:t xml:space="preserve">49</w:t>
+            </w:r>
+          </w:p>
+        </w:tc>
+        <w:tc>
+          <w:tcPr>
+            <w:tcBorders>
+              <w:top w:color="bfbfbf" w:space="0" w:sz="4" w:val="single"/>
+              <w:left w:color="bfbfbf" w:space="0" w:sz="4" w:val="single"/>
+              <w:bottom w:color="bfbfbf" w:space="0" w:sz="4" w:val="single"/>
+              <w:right w:color="bfbfbf" w:space="0" w:sz="4" w:val="single"/>
+            </w:tcBorders>
+            <w:tcMar>
+              <w:top w:w="50.0" w:type="dxa"/>
+              <w:left w:w="80.0" w:type="dxa"/>
+              <w:bottom w:w="50.0" w:type="dxa"/>
+              <w:right w:w="80.0" w:type="dxa"/>
+            </w:tcMar>
+            <w:vAlign w:val="top"/>
+          </w:tcPr>
+          <w:p>
+            <w:pPr>
+              <w:spacing w:line="240" w:lineRule="auto"/>
+              <w:rPr>
+                <w:rFonts w:ascii="Calibri" w:cs="Calibri" w:eastAsia="Calibri" w:hAnsi="Calibri"/>
+                <w:color w:val="1a1a1a"/>
+              </w:rPr>
+            </w:pPr>
+            <w:r>
+              <w:rPr>
+                <w:rFonts w:ascii="Calibri" w:cs="Calibri" w:eastAsia="Calibri" w:hAnsi="Calibri"/>
+                <w:color w:val="1a1a1a"/>
+                <w:sz w:val="17"/>
+                <w:szCs w:val="17"/>
+                <w:rtl w:val="0"/>
+              </w:rPr>
+              <w:t xml:space="preserve">18,488.3</w:t>
+            </w:r>
+          </w:p>
+        </w:tc>
+        <w:tc>
+          <w:tcPr>
+            <w:tcBorders>
+              <w:top w:color="bfbfbf" w:space="0" w:sz="4" w:val="single"/>
+              <w:left w:color="bfbfbf" w:space="0" w:sz="4" w:val="single"/>
+              <w:bottom w:color="bfbfbf" w:space="0" w:sz="4" w:val="single"/>
+              <w:right w:color="bfbfbf" w:space="0" w:sz="4" w:val="single"/>
+            </w:tcBorders>
+            <w:tcMar>
+              <w:top w:w="50.0" w:type="dxa"/>
+              <w:left w:w="80.0" w:type="dxa"/>
+              <w:bottom w:w="50.0" w:type="dxa"/>
+              <w:right w:w="80.0" w:type="dxa"/>
+            </w:tcMar>
+            <w:vAlign w:val="top"/>
+          </w:tcPr>
+          <w:p>
+            <w:pPr>
+              <w:spacing w:line="240" w:lineRule="auto"/>
+              <w:rPr>
+                <w:rFonts w:ascii="Calibri" w:cs="Calibri" w:eastAsia="Calibri" w:hAnsi="Calibri"/>
+                <w:color w:val="1a1a1a"/>
+              </w:rPr>
+            </w:pPr>
+            <w:r>
+              <w:rPr>
+                <w:rFonts w:ascii="Calibri" w:cs="Calibri" w:eastAsia="Calibri" w:hAnsi="Calibri"/>
+                <w:color w:val="1a1a1a"/>
+                <w:sz w:val="17"/>
+                <w:szCs w:val="17"/>
+                <w:rtl w:val="0"/>
+              </w:rPr>
+              <w:t xml:space="preserve">No improvement (LRT p = 0.94)</w:t>
+            </w:r>
+          </w:p>
+        </w:tc>
+      </w:tr>
+      <w:tr>
+        <w:trPr>
+          <w:cantSplit w:val="1"/>
+          <w:tblHeader w:val="0"/>
+        </w:trPr>
+        <w:tc>
+          <w:tcPr>
+            <w:tcBorders>
+              <w:top w:color="bfbfbf" w:space="0" w:sz="4" w:val="single"/>
+              <w:left w:color="bfbfbf" w:space="0" w:sz="4" w:val="single"/>
+              <w:bottom w:color="bfbfbf" w:space="0" w:sz="4" w:val="single"/>
+              <w:right w:color="bfbfbf" w:space="0" w:sz="4" w:val="single"/>
+            </w:tcBorders>
+            <w:tcMar>
+              <w:top w:w="50.0" w:type="dxa"/>
+              <w:left w:w="80.0" w:type="dxa"/>
+              <w:bottom w:w="50.0" w:type="dxa"/>
+              <w:right w:w="80.0" w:type="dxa"/>
+            </w:tcMar>
+            <w:vAlign w:val="top"/>
+          </w:tcPr>
+          <w:p>
+            <w:pPr>
+              <w:spacing w:line="240" w:lineRule="auto"/>
+              <w:rPr>
+                <w:rFonts w:ascii="Calibri" w:cs="Calibri" w:eastAsia="Calibri" w:hAnsi="Calibri"/>
+                <w:color w:val="1a1a1a"/>
+              </w:rPr>
+            </w:pPr>
+            <w:r>
+              <w:rPr>
+                <w:rFonts w:ascii="Calibri" w:cs="Calibri" w:eastAsia="Calibri" w:hAnsi="Calibri"/>
+                <w:color w:val="1a1a1a"/>
+                <w:sz w:val="17"/>
+                <w:szCs w:val="17"/>
+                <w:rtl w:val="0"/>
+              </w:rPr>
+              <w:t xml:space="preserve">M6</w:t>
+            </w:r>
+          </w:p>
+        </w:tc>
+        <w:tc>
+          <w:tcPr>
+            <w:tcBorders>
+              <w:top w:color="bfbfbf" w:space="0" w:sz="4" w:val="single"/>
+              <w:left w:color="bfbfbf" w:space="0" w:sz="4" w:val="single"/>
+              <w:bottom w:color="bfbfbf" w:space="0" w:sz="4" w:val="single"/>
+              <w:right w:color="bfbfbf" w:space="0" w:sz="4" w:val="single"/>
+            </w:tcBorders>
+            <w:tcMar>
+              <w:top w:w="50.0" w:type="dxa"/>
+              <w:left w:w="80.0" w:type="dxa"/>
+              <w:bottom w:w="50.0" w:type="dxa"/>
+              <w:right w:w="80.0" w:type="dxa"/>
+            </w:tcMar>
+            <w:vAlign w:val="top"/>
+          </w:tcPr>
+          <w:p>
+            <w:pPr>
+              <w:spacing w:line="240" w:lineRule="auto"/>
+              <w:rPr>
+                <w:rFonts w:ascii="Calibri" w:cs="Calibri" w:eastAsia="Calibri" w:hAnsi="Calibri"/>
+                <w:color w:val="1a1a1a"/>
+              </w:rPr>
+            </w:pPr>
+            <w:r>
+              <w:rPr>
+                <w:rFonts w:ascii="Calibri" w:cs="Calibri" w:eastAsia="Calibri" w:hAnsi="Calibri"/>
+                <w:color w:val="1a1a1a"/>
+                <w:sz w:val="17"/>
+                <w:szCs w:val="17"/>
+                <w:rtl w:val="0"/>
+              </w:rPr>
+              <w:t xml:space="preserve">M4 + interaction contact × age group</w:t>
+            </w:r>
+          </w:p>
+        </w:tc>
+        <w:tc>
+          <w:tcPr>
+            <w:tcBorders>
+              <w:top w:color="bfbfbf" w:space="0" w:sz="4" w:val="single"/>
+              <w:left w:color="bfbfbf" w:space="0" w:sz="4" w:val="single"/>
+              <w:bottom w:color="bfbfbf" w:space="0" w:sz="4" w:val="single"/>
+              <w:right w:color="bfbfbf" w:space="0" w:sz="4" w:val="single"/>
+            </w:tcBorders>
+            <w:tcMar>
+              <w:top w:w="50.0" w:type="dxa"/>
+              <w:left w:w="80.0" w:type="dxa"/>
+              <w:bottom w:w="50.0" w:type="dxa"/>
+              <w:right w:w="80.0" w:type="dxa"/>
+            </w:tcMar>
+            <w:vAlign w:val="top"/>
+          </w:tcPr>
+          <w:p>
+            <w:pPr>
+              <w:spacing w:line="240" w:lineRule="auto"/>
+              <w:rPr>
+                <w:rFonts w:ascii="Calibri" w:cs="Calibri" w:eastAsia="Calibri" w:hAnsi="Calibri"/>
+                <w:color w:val="1a1a1a"/>
+              </w:rPr>
+            </w:pPr>
+            <w:r>
+              <w:rPr>
+                <w:rFonts w:ascii="Calibri" w:cs="Calibri" w:eastAsia="Calibri" w:hAnsi="Calibri"/>
+                <w:color w:val="1a1a1a"/>
+                <w:sz w:val="17"/>
+                <w:szCs w:val="17"/>
+                <w:rtl w:val="0"/>
+              </w:rPr>
+              <w:t xml:space="preserve">52</w:t>
+            </w:r>
+          </w:p>
+        </w:tc>
+        <w:tc>
+          <w:tcPr>
+            <w:tcBorders>
+              <w:top w:color="bfbfbf" w:space="0" w:sz="4" w:val="single"/>
+              <w:left w:color="bfbfbf" w:space="0" w:sz="4" w:val="single"/>
+              <w:bottom w:color="bfbfbf" w:space="0" w:sz="4" w:val="single"/>
+              <w:right w:color="bfbfbf" w:space="0" w:sz="4" w:val="single"/>
+            </w:tcBorders>
+            <w:tcMar>
+              <w:top w:w="50.0" w:type="dxa"/>
+              <w:left w:w="80.0" w:type="dxa"/>
+              <w:bottom w:w="50.0" w:type="dxa"/>
+              <w:right w:w="80.0" w:type="dxa"/>
+            </w:tcMar>
+            <w:vAlign w:val="top"/>
+          </w:tcPr>
+          <w:p>
+            <w:pPr>
+              <w:spacing w:line="240" w:lineRule="auto"/>
+              <w:rPr>
+                <w:rFonts w:ascii="Calibri" w:cs="Calibri" w:eastAsia="Calibri" w:hAnsi="Calibri"/>
+                <w:color w:val="1a1a1a"/>
+              </w:rPr>
+            </w:pPr>
+            <w:r>
+              <w:rPr>
+                <w:rFonts w:ascii="Calibri" w:cs="Calibri" w:eastAsia="Calibri" w:hAnsi="Calibri"/>
+                <w:color w:val="1a1a1a"/>
+                <w:sz w:val="17"/>
+                <w:szCs w:val="17"/>
+                <w:rtl w:val="0"/>
+              </w:rPr>
+              <w:t xml:space="preserve">18,487.1</w:t>
+            </w:r>
+          </w:p>
+        </w:tc>
+        <w:tc>
+          <w:tcPr>
+            <w:tcBorders>
+              <w:top w:color="bfbfbf" w:space="0" w:sz="4" w:val="single"/>
+              <w:left w:color="bfbfbf" w:space="0" w:sz="4" w:val="single"/>
+              <w:bottom w:color="bfbfbf" w:space="0" w:sz="4" w:val="single"/>
+              <w:right w:color="bfbfbf" w:space="0" w:sz="4" w:val="single"/>
+            </w:tcBorders>
+            <w:tcMar>
+              <w:top w:w="50.0" w:type="dxa"/>
+              <w:left w:w="80.0" w:type="dxa"/>
+              <w:bottom w:w="50.0" w:type="dxa"/>
+              <w:right w:w="80.0" w:type="dxa"/>
+            </w:tcMar>
+            <w:vAlign w:val="top"/>
+          </w:tcPr>
+          <w:p>
+            <w:pPr>
+              <w:spacing w:line="240" w:lineRule="auto"/>
+              <w:rPr>
+                <w:rFonts w:ascii="Calibri" w:cs="Calibri" w:eastAsia="Calibri" w:hAnsi="Calibri"/>
+                <w:color w:val="1a1a1a"/>
+              </w:rPr>
+            </w:pPr>
+            <w:r>
+              <w:rPr>
+                <w:rFonts w:ascii="Calibri" w:cs="Calibri" w:eastAsia="Calibri" w:hAnsi="Calibri"/>
+                <w:color w:val="1a1a1a"/>
+                <w:sz w:val="17"/>
+                <w:szCs w:val="17"/>
+                <w:rtl w:val="0"/>
+              </w:rPr>
+              <w:t xml:space="preserve">No improvement (LRT p = 0.20)</w:t>
+            </w:r>
+          </w:p>
+        </w:tc>
+      </w:tr>
+    </w:tbl>
+    <w:p>
+      <w:pPr>
+        <w:keepNext w:val="1"/>
+        <w:spacing w:after="80" w:before="160" w:line="240" w:lineRule="auto"/>
+        <w:jc w:val="center"/>
+        <w:rPr>
+          <w:rFonts w:ascii="Calibri" w:cs="Calibri" w:eastAsia="Calibri" w:hAnsi="Calibri"/>
+          <w:i w:val="1"/>
+          <w:iCs w:val="1"/>
+          <w:color w:val="555555"/>
+          <w:sz w:val="17"/>
+          <w:szCs w:val="17"/>
+        </w:rPr>
+      </w:pPr>
+      <w:r>
+        <w:rPr>
+          <w:rFonts w:ascii="Calibri" w:cs="Calibri" w:eastAsia="Calibri" w:hAnsi="Calibri"/>
+          <w:i w:val="1"/>
+          <w:iCs w:val="1"/>
+          <w:color w:val="555555"/>
+          <w:sz w:val="19"/>
+          <w:szCs w:val="19"/>
+          <w:rtl w:val="0"/>
+        </w:rPr>
+        <w:t xml:space="preserve">Table 4. Candidate logistic regression models, fitted on the training set (lower AIC is better)</w:t>
       </w:r>
     </w:p>
     <w:p>
@@ -4498,7 +5861,7 @@
           <w:color w:val="1a1a1a"/>
           <w:rtl w:val="0"/>
         </w:rPr>
-        <w:t xml:space="preserve">All four models rank customers well (Table 4, Figure 2): test ROC-AUC is 0.797 to 0.807, and PR-AUC is about four times the no-skill value of 0.113. Gradient boosting beats logistic regression in CV by 0.008 AUC (paired t-test p = 0.013), but the 95% bootstrap CI for the test difference includes zero (−0.0003 to 0.015). The top 20% ranked by either of these two models hold 65% to 66% of subscribers (Figure 3).</w:t>
+        <w:t xml:space="preserve">All four models rank customers well (Table 5, Figure 2): test ROC-AUC is 0.797 to 0.807, and PR-AUC is about four times the no-skill value of 0.113. Gradient boosting beats logistic regression in CV by 0.008 AUC (paired t-test p = 0.013), but the 95% bootstrap CI for the test difference includes zero (−0.0003 to 0.015). The top 20% ranked by either of these two models hold 65% to 66% of subscribers (Figure 3).</w:t>
       </w:r>
     </w:p>
     <w:p>
@@ -4537,7 +5900,7 @@
           <w:szCs w:val="19"/>
           <w:rtl w:val="0"/>
         </w:rPr>
-        <w:t xml:space="preserve">Table 4. Model performance (CV on training set; test set n = 8,234; phase-3 test n = 2,054)</w:t>
+        <w:t xml:space="preserve">Table 5. Model performance (CV on training set; test set n = 8,234; phase-3 test n = 2,054)</w:t>
       </w:r>
       <w:r>
         <w:rPr>
@@ -6939,7 +8302,7 @@
           <w:color w:val="1a1a1a"/>
           <w:rtl w:val="0"/>
         </w:rPr>
-        <w:t xml:space="preserve">Compared with ages 35-44, the odds are 1.48 times higher at 65+ and 1.30 times higher at 17-24. Once age is in the model, the student and retired effects are not significant (p = 0.25 and 0.18), so their high raw rates (31% and 25%) mainly reflect age. Interactions of contact type with previous outcome and with age group did not improve the model (LRT p = 0.94 and 0.20).</w:t>
+        <w:t xml:space="preserve">Compared with ages 35-44, the odds are 1.48 times higher at 65+ and 1.30 times higher at 17-24. Once age is in the model, the student and retired effects are not significant (p = 0.25 and 0.18), so their high raw rates (31% and 25%) mainly reflect age. M5 and M6 did not improve on M4 (LRT p = 0.94 and 0.20).</w:t>
       </w:r>
     </w:p>
     <w:p>
@@ -7271,7 +8634,7 @@
           <w:color w:val="1a1a1a"/>
           <w:rtl w:val="0"/>
         </w:rPr>
-        <w:t xml:space="preserve">The Bayesian logistic regression converged (largest R-hat 1.003, smallest ESS 1,199; Figure 7). Its posterior odds ratios match the maximum likelihood estimates within 0.11 standard errors, so the data outweigh the prior, and a tighter prior moves no coefficient by more than 1.1 standard errors (Appendix G). Unlike a confidence interval, a credible interval gives probabilities directly: the odds ratio for a previous success exceeds 3 with probability 0.996.</w:t>
+        <w:t xml:space="preserve">The Bayesian logistic regression converged (largest R-hat 1.003, smallest ESS 1,199; Figure 7). Its odds ratios match the MLE within 0.11 standard errors, and a tighter prior moves no coefficient by more than 1.1 standard errors (Appendix G), so the data outweigh the prior. Unlike a confidence interval, a credible interval gives probabilities directly: the odds ratio for a previous success exceeds 3 with probability 0.996.</w:t>
       </w:r>
     </w:p>
     <w:p>
@@ -7373,7 +8736,7 @@
           <w:szCs w:val="19"/>
           <w:rtl w:val="0"/>
         </w:rPr>
-        <w:t xml:space="preserve">Table 5. Hypothesis outcomes</w:t>
+        <w:t xml:space="preserve">Table 6. Hypothesis outcomes</w:t>
       </w:r>
       <w:r>
         <w:rPr>
@@ -8275,7 +9638,7 @@
           <w:color w:val="1a1a1a"/>
           <w:rtl w:val="0"/>
         </w:rPr>
-        <w:t xml:space="preserve">Call previous subscribers first: they are 3.3% of customers but 19.2% of subscribers (Table 6). Design offers by age group, since job adds little once age is known. Call mobiles first and stop after three attempts: customers needing more than three calls are 18.5% of customers but 12.0% of subscribers.</w:t>
+        <w:t xml:space="preserve">Call previous subscribers first: they are 3.3% of customers but 19.2% of subscribers (Table 7). Design offers by age group, since job adds little once age is known. Call mobiles first and stop after three attempts: customers needing more than three calls are 18.5% of customers but 12.0% of subscribers.</w:t>
       </w:r>
     </w:p>
     <w:p>
@@ -8314,7 +9677,7 @@
           <w:szCs w:val="19"/>
           <w:rtl w:val="0"/>
         </w:rPr>
-        <w:t xml:space="preserve">Table 6. Insights, evidence and recommended actions</w:t>
+        <w:t xml:space="preserve">Table 7. Insights, evidence and recommended actions</w:t>
       </w:r>
       <w:r>
         <w:rPr>
@@ -9534,7 +10897,7 @@
           <w:color w:val="1a1a1a"/>
           <w:rtl w:val="0"/>
         </w:rPr>
-        <w:t xml:space="preserve">Adding an Indigenous identifier to the data would not fix this on its own. The Maiam nayri Wingara principles give Aboriginal and Torres Strait Islander people control of the data ecosystem and the right to data that support self-determination (Maiam nayri Wingara &amp; AIGI, 2018). The CARE principles add collective benefit and authority to control (Carroll et al., 2020). Such data should be collected only with free, prior and informed consent, governed with Aboriginal community-controlled organisations, and reported back to communities (Table 7). I would also avoid building proxies for Indigeneity from location or contact type, because group-level inferences can harm a community even when individuals are anonymous.</w:t>
+        <w:t xml:space="preserve">Adding an Indigenous identifier to the data would not fix this on its own. The Maiam nayri Wingara principles give Aboriginal and Torres Strait Islander people control of the data ecosystem and the right to data that support self-determination (Maiam nayri Wingara &amp; AIGI, 2018). The CARE principles add collective benefit and authority to control (Carroll et al., 2020). Such data should be collected only with free, prior and informed consent, governed with Aboriginal community-controlled organisations, and reported back to communities (Table 8). I would also avoid building proxies for Indigeneity from location or contact type, because group-level inferences can harm a community even when individuals are anonymous.</w:t>
       </w:r>
     </w:p>
     <w:p>
@@ -9556,7 +10919,7 @@
           <w:szCs w:val="19"/>
           <w:rtl w:val="0"/>
         </w:rPr>
-        <w:t xml:space="preserve">Table 7. Ethical risks and recommended controls for business stakeholders and end users</w:t>
+        <w:t xml:space="preserve">Table 8. Ethical risks and recommended controls for business stakeholders and end users</w:t>
       </w:r>
       <w:r>
         <w:rPr>
@@ -10706,7 +12069,7 @@
           <w:color w:val="1a1a1a"/>
           <w:rtl w:val="0"/>
         </w:rPr>
-        <w:t xml:space="preserve">The most responsive segments are previous subscribers, customers under 25 or over 65, and customers reached by mobile (RQ1; Table 5). The logistic model ranks customers before a call with test AUC 0.80, but AUC falls to 0.67 on a later phase (RQ2). For RQ3, the company should call previous subscribers first, prefer mobiles, stop after three attempts and call only the model’s top 20% to 30%. The next step is a one-month trial comparing a model-ranked list with an equal random list.</w:t>
+        <w:t xml:space="preserve">The most responsive segments are previous subscribers, customers under 25 or over 65, and customers reached by mobile (RQ1; Table 6). The logistic model ranks customers before a call with test AUC 0.80, but AUC falls to 0.67 on a later phase (RQ2). For RQ3, the company should call previous subscribers first, prefer mobiles, stop after three attempts and call only the model’s top 20% to 30%. The next step is a one-month trial comparing a model-ranked list with an equal random list.</w:t>
       </w:r>
     </w:p>
     <w:p>
@@ -18557,6 +19920,24 @@
     </w:tbl>
     <w:p>
       <w:pPr>
+        <w:spacing w:after="200" w:before="60" w:line="240" w:lineRule="auto"/>
+        <w:rPr/>
+      </w:pPr>
+      <w:r>
+        <w:rPr>
+          <w:rFonts w:ascii="Calibri" w:cs="Calibri" w:eastAsia="Calibri" w:hAnsi="Calibri"/>
+          <w:i w:val="1"/>
+          <w:iCs w:val="1"/>
+          <w:color w:val="555555"/>
+          <w:sz w:val="17"/>
+          <w:szCs w:val="17"/>
+          <w:rtl w:val="0"/>
+        </w:rPr>
+        <w:t xml:space="preserve">Note. M1 to M6 are defined in Table 4. “M4 using euribor3m” replaces nr.employed with euribor3m. The last three rows change only how age enters M4: left out, as a straight line, or as a curve (age + age²). Lower AIC and BIC mean a better balance between fit and number of parameters; McFadden R² is a pseudo R² for logistic models.</w:t>
+      </w:r>
+    </w:p>
+    <w:p>
+      <w:pPr>
         <w:spacing w:after="160" w:line="240" w:lineRule="auto"/>
         <w:rPr>
           <w:rFonts w:ascii="Calibri" w:cs="Calibri" w:eastAsia="Calibri" w:hAnsi="Calibri"/>
@@ -40418,7 +41799,7 @@
           <w:szCs w:val="17"/>
           <w:rtl w:val="0"/>
         </w:rPr>
-        <w:t xml:space="preserve">Note. Normal(0, 2.5²) priors; 4 chains, 4,400 retained draws. All 46 terms are in tables/bayes_logit_vs_mle.csv. With the tighter Normal(0, 0.5²) prior the largest shift in a posterior mean is 1.1 standard errors (median 0.24); for the terms in Table 6 it is 0.6 or less.</w:t>
+        <w:t xml:space="preserve">Note. Normal(0, 2.5²) priors; 4 chains, 4,400 retained draws. All 46 terms are in tables/bayes_logit_vs_mle.csv. With the tighter Normal(0, 0.5²) prior the largest shift in a posterior mean is 1.1 standard errors (median 0.24); for the terms in Table 7 it is 0.6 or less.</w:t>
       </w:r>
       <w:r>
         <w:rPr>

</xml_diff>